<commit_message>
docs: update Massive — key confirmed on Vercel
</commit_message>
<xml_diff>
--- a/AlphaBrief-Services-Reference.docx
+++ b/AlphaBrief-Services-Reference.docx
@@ -65,7 +65,7 @@
           <w:sz w:val="20"/>
           <w:szCs w:val="20"/>
         </w:rPr>
-        <w:t xml:space="preserve">Auto-generated on push · June 19, 2026  ·  commit 156daf5</w:t>
+        <w:t xml:space="preserve">Auto-generated on push · June 19, 2026  ·  commit 35db39e</w:t>
       </w:r>
     </w:p>
     <w:p>
@@ -2438,7 +2438,7 @@
           <w:sz w:val="22"/>
           <w:szCs w:val="22"/>
         </w:rPr>
-        <w:t xml:space="preserve">Status: API key obtained and stored in .env.local. NOT yet wired into any route. NOT yet added to Vercel. Add to Vercel before deploying any feature that uses it.</w:t>
+        <w:t xml:space="preserve">Status: API key stored in .env.local AND Vercel. Not yet wired into any route — integration pending.</w:t>
       </w:r>
     </w:p>
     <w:p>
@@ -2473,7 +2473,7 @@
           <w:sz w:val="22"/>
           <w:szCs w:val="22"/>
         </w:rPr>
-        <w:t xml:space="preserve">•  Env var: MASSIVE_API_KEY (currently in .env.local only)</w:t>
+        <w:t xml:space="preserve">•  Env var: MASSIVE_API_KEY (in .env.local and Vercel environment variables)</w:t>
       </w:r>
     </w:p>
     <w:p>
@@ -3320,7 +3320,7 @@
               <w:bottom w:val="single" w:color="CCCCCC" w:sz="1"/>
               <w:right w:val="single" w:color="CCCCCC" w:sz="1"/>
             </w:tcBorders>
-            <w:shd w:fill="FEF9C3" w:val="clear"/>
+            <w:shd w:fill="FFFFFF" w:val="clear"/>
             <w:tcMar>
               <w:top w:type="dxa" w:w="80"/>
               <w:left w:type="dxa" w:w="120"/>
@@ -3349,23 +3349,23 @@
               <w:bottom w:val="single" w:color="CCCCCC" w:sz="1"/>
               <w:right w:val="single" w:color="CCCCCC" w:sz="1"/>
             </w:tcBorders>
-            <w:shd w:fill="FEF9C3" w:val="clear"/>
-            <w:tcMar>
-              <w:top w:type="dxa" w:w="80"/>
-              <w:left w:type="dxa" w:w="120"/>
-              <w:bottom w:type="dxa" w:w="80"/>
-              <w:right w:type="dxa" w:w="120"/>
-            </w:tcMar>
-          </w:tcPr>
-          <w:p>
-            <w:r>
-              <w:rPr>
-                <w:rFonts w:ascii="Arial" w:cs="Arial" w:eastAsia="Arial" w:hAnsi="Arial"/>
-                <w:color w:val="B45309"/>
-                <w:sz w:val="20"/>
-                <w:szCs w:val="20"/>
-              </w:rPr>
-              <w:t xml:space="preserve">Not yet used</w:t>
+            <w:shd w:fill="FFFFFF" w:val="clear"/>
+            <w:tcMar>
+              <w:top w:type="dxa" w:w="80"/>
+              <w:left w:type="dxa" w:w="120"/>
+              <w:bottom w:type="dxa" w:w="80"/>
+              <w:right w:type="dxa" w:w="120"/>
+            </w:tcMar>
+          </w:tcPr>
+          <w:p>
+            <w:r>
+              <w:rPr>
+                <w:rFonts w:ascii="Arial" w:cs="Arial" w:eastAsia="Arial" w:hAnsi="Arial"/>
+                <w:color w:val="0F172A"/>
+                <w:sz w:val="20"/>
+                <w:szCs w:val="20"/>
+              </w:rPr>
+              <w:t xml:space="preserve">Not yet used in any route</w:t>
             </w:r>
           </w:p>
         </w:tc>
@@ -3378,23 +3378,23 @@
               <w:bottom w:val="single" w:color="CCCCCC" w:sz="1"/>
               <w:right w:val="single" w:color="CCCCCC" w:sz="1"/>
             </w:tcBorders>
-            <w:shd w:fill="FEF9C3" w:val="clear"/>
-            <w:tcMar>
-              <w:top w:type="dxa" w:w="80"/>
-              <w:left w:type="dxa" w:w="120"/>
-              <w:bottom w:type="dxa" w:w="80"/>
-              <w:right w:type="dxa" w:w="120"/>
-            </w:tcMar>
-          </w:tcPr>
-          <w:p>
-            <w:r>
-              <w:rPr>
-                <w:rFonts w:ascii="Arial" w:cs="Arial" w:eastAsia="Arial" w:hAnsi="Arial"/>
-                <w:color w:val="B45309"/>
-                <w:sz w:val="20"/>
-                <w:szCs w:val="20"/>
-              </w:rPr>
-              <w:t xml:space="preserve">⚠️ In .env.local only. Add to Vercel before first feature that calls Massive API.</w:t>
+            <w:shd w:fill="FFFFFF" w:val="clear"/>
+            <w:tcMar>
+              <w:top w:type="dxa" w:w="80"/>
+              <w:left w:type="dxa" w:w="120"/>
+              <w:bottom w:type="dxa" w:w="80"/>
+              <w:right w:type="dxa" w:w="120"/>
+            </w:tcMar>
+          </w:tcPr>
+          <w:p>
+            <w:r>
+              <w:rPr>
+                <w:rFonts w:ascii="Arial" w:cs="Arial" w:eastAsia="Arial" w:hAnsi="Arial"/>
+                <w:color w:val="0F172A"/>
+                <w:sz w:val="20"/>
+                <w:szCs w:val="20"/>
+              </w:rPr>
+              <w:t xml:space="preserve">In .env.local and Vercel. Ready to use — just wire it into a route.</w:t>
             </w:r>
           </w:p>
         </w:tc>
@@ -5466,19 +5466,19 @@
               <w:bottom w:val="single" w:color="CCCCCC" w:sz="1"/>
               <w:right w:val="single" w:color="CCCCCC" w:sz="1"/>
             </w:tcBorders>
-            <w:shd w:fill="FEF9C3" w:val="clear"/>
-            <w:tcMar>
-              <w:top w:type="dxa" w:w="80"/>
-              <w:left w:type="dxa" w:w="120"/>
-              <w:bottom w:type="dxa" w:w="80"/>
-              <w:right w:type="dxa" w:w="120"/>
-            </w:tcMar>
-          </w:tcPr>
-          <w:p>
-            <w:r>
-              <w:rPr>
-                <w:rFonts w:ascii="Arial" w:cs="Arial" w:eastAsia="Arial" w:hAnsi="Arial"/>
-                <w:color w:val="B45309"/>
+            <w:shd w:fill="FFFFFF" w:val="clear"/>
+            <w:tcMar>
+              <w:top w:type="dxa" w:w="80"/>
+              <w:left w:type="dxa" w:w="120"/>
+              <w:bottom w:type="dxa" w:w="80"/>
+              <w:right w:type="dxa" w:w="120"/>
+            </w:tcMar>
+          </w:tcPr>
+          <w:p>
+            <w:r>
+              <w:rPr>
+                <w:rFonts w:ascii="Arial" w:cs="Arial" w:eastAsia="Arial" w:hAnsi="Arial"/>
+                <w:color w:val="0F172A"/>
                 <w:sz w:val="20"/>
                 <w:szCs w:val="20"/>
               </w:rPr>
@@ -5495,19 +5495,19 @@
               <w:bottom w:val="single" w:color="CCCCCC" w:sz="1"/>
               <w:right w:val="single" w:color="CCCCCC" w:sz="1"/>
             </w:tcBorders>
-            <w:shd w:fill="FEF9C3" w:val="clear"/>
-            <w:tcMar>
-              <w:top w:type="dxa" w:w="80"/>
-              <w:left w:type="dxa" w:w="120"/>
-              <w:bottom w:type="dxa" w:w="80"/>
-              <w:right w:type="dxa" w:w="120"/>
-            </w:tcMar>
-          </w:tcPr>
-          <w:p>
-            <w:r>
-              <w:rPr>
-                <w:rFonts w:ascii="Arial" w:cs="Arial" w:eastAsia="Arial" w:hAnsi="Arial"/>
-                <w:color w:val="B45309"/>
+            <w:shd w:fill="FFFFFF" w:val="clear"/>
+            <w:tcMar>
+              <w:top w:type="dxa" w:w="80"/>
+              <w:left w:type="dxa" w:w="120"/>
+              <w:bottom w:type="dxa" w:w="80"/>
+              <w:right w:type="dxa" w:w="120"/>
+            </w:tcMar>
+          </w:tcPr>
+          <w:p>
+            <w:r>
+              <w:rPr>
+                <w:rFonts w:ascii="Arial" w:cs="Arial" w:eastAsia="Arial" w:hAnsi="Arial"/>
+                <w:color w:val="0F172A"/>
                 <w:sz w:val="20"/>
                 <w:szCs w:val="20"/>
               </w:rPr>
@@ -5524,19 +5524,19 @@
               <w:bottom w:val="single" w:color="CCCCCC" w:sz="1"/>
               <w:right w:val="single" w:color="CCCCCC" w:sz="1"/>
             </w:tcBorders>
-            <w:shd w:fill="FEF9C3" w:val="clear"/>
-            <w:tcMar>
-              <w:top w:type="dxa" w:w="80"/>
-              <w:left w:type="dxa" w:w="120"/>
-              <w:bottom w:type="dxa" w:w="80"/>
-              <w:right w:type="dxa" w:w="120"/>
-            </w:tcMar>
-          </w:tcPr>
-          <w:p>
-            <w:r>
-              <w:rPr>
-                <w:rFonts w:ascii="Arial" w:cs="Arial" w:eastAsia="Arial" w:hAnsi="Arial"/>
-                <w:color w:val="B45309"/>
+            <w:shd w:fill="FFFFFF" w:val="clear"/>
+            <w:tcMar>
+              <w:top w:type="dxa" w:w="80"/>
+              <w:left w:type="dxa" w:w="120"/>
+              <w:bottom w:type="dxa" w:w="80"/>
+              <w:right w:type="dxa" w:w="120"/>
+            </w:tcMar>
+          </w:tcPr>
+          <w:p>
+            <w:r>
+              <w:rPr>
+                <w:rFonts w:ascii="Arial" w:cs="Arial" w:eastAsia="Arial" w:hAnsi="Arial"/>
+                <w:color w:val="0F172A"/>
                 <w:sz w:val="20"/>
                 <w:szCs w:val="20"/>
               </w:rPr>
@@ -5553,23 +5553,23 @@
               <w:bottom w:val="single" w:color="CCCCCC" w:sz="1"/>
               <w:right w:val="single" w:color="CCCCCC" w:sz="1"/>
             </w:tcBorders>
-            <w:shd w:fill="FEF9C3" w:val="clear"/>
-            <w:tcMar>
-              <w:top w:type="dxa" w:w="80"/>
-              <w:left w:type="dxa" w:w="120"/>
-              <w:bottom w:type="dxa" w:w="80"/>
-              <w:right w:type="dxa" w:w="120"/>
-            </w:tcMar>
-          </w:tcPr>
-          <w:p>
-            <w:r>
-              <w:rPr>
-                <w:rFonts w:ascii="Arial" w:cs="Arial" w:eastAsia="Arial" w:hAnsi="Arial"/>
-                <w:color w:val="B45309"/>
-                <w:sz w:val="20"/>
-                <w:szCs w:val="20"/>
-              </w:rPr>
-              <w:t xml:space="preserve">⚠️ Key in .env.local only — add to Vercel before first use</w:t>
+            <w:shd w:fill="FFFFFF" w:val="clear"/>
+            <w:tcMar>
+              <w:top w:type="dxa" w:w="80"/>
+              <w:left w:type="dxa" w:w="120"/>
+              <w:bottom w:type="dxa" w:w="80"/>
+              <w:right w:type="dxa" w:w="120"/>
+            </w:tcMar>
+          </w:tcPr>
+          <w:p>
+            <w:r>
+              <w:rPr>
+                <w:rFonts w:ascii="Arial" w:cs="Arial" w:eastAsia="Arial" w:hAnsi="Arial"/>
+                <w:color w:val="0F172A"/>
+                <w:sz w:val="20"/>
+                <w:szCs w:val="20"/>
+              </w:rPr>
+              <w:t xml:space="preserve">Key in .env.local and Vercel. Not yet used in code — integration pending.</w:t>
             </w:r>
           </w:p>
         </w:tc>
@@ -5944,7 +5944,7 @@
         <w:sz w:val="18"/>
         <w:szCs w:val="18"/>
       </w:rPr>
-      <w:t xml:space="preserve">	June 19, 2026  ·  commit 156daf5</w:t>
+      <w:t xml:space="preserve">	June 19, 2026  ·  commit 35db39e</w:t>
     </w:r>
   </w:p>
 </w:hdr>

</xml_diff>

<commit_message>
docs: sync CLAUDE.md + services reference to actual code; fix docx generator require
</commit_message>
<xml_diff>
--- a/AlphaBrief-Services-Reference.docx
+++ b/AlphaBrief-Services-Reference.docx
@@ -46,7 +46,7 @@
           <w:sz w:val="18"/>
           <w:szCs w:val="18"/>
         </w:rPr>
-        <w:t xml:space="preserve">Last updated: June 21, 2026  |  CONFIDENTIAL — internal use only</w:t>
+        <w:t xml:space="preserve">Last updated: July 24, 2026  |  CONFIDENTIAL — internal use only</w:t>
       </w:r>
     </w:p>
     <w:p>
@@ -380,7 +380,7 @@
                 <w:sz w:val="18"/>
                 <w:szCs w:val="18"/>
               </w:rPr>
-              <w:t xml:space="preserve">June 21, 2026</w:t>
+              <w:t xml:space="preserve">July 24, 2026</w:t>
             </w:r>
           </w:p>
         </w:tc>
@@ -612,7 +612,7 @@
                 <w:sz w:val="18"/>
                 <w:szCs w:val="18"/>
               </w:rPr>
-              <w:t xml:space="preserve">Private GitHub — push via: cd ~/Desktop/alphabrief &amp;&amp; git push</w:t>
+              <w:t xml:space="preserve">Private GitHub — push via: cd "$HOME/Desktop/TEAMs/Team Business/alphabrief" &amp;&amp; git push</w:t>
             </w:r>
           </w:p>
         </w:tc>
@@ -974,7 +974,7 @@
                 <w:sz w:val="18"/>
                 <w:szCs w:val="18"/>
               </w:rPr>
-              <w:t xml:space="preserve">AI-generated stock analysis: about, quickTake, thesis, catalystEvent, catalystDriver</w:t>
+              <w:t xml:space="preserve">AI-generated stock analysis and portfolio briefs</w:t>
             </w:r>
           </w:p>
         </w:tc>
@@ -1030,7 +1030,7 @@
                 <w:sz w:val="18"/>
                 <w:szCs w:val="18"/>
               </w:rPr>
-              <w:t xml:space="preserve">Model: claude-haiku-4-5-20251001. Max 500 tokens per card. Returns JSON only (no markdown fences).</w:t>
+              <w:t xml:space="preserve">Per-card detail + thesis-alerts news classification: claude-haiku-4-5-20251001, max_tokens 650 (JSON only). Portfolio brief (/api/brief): claude-sonnet-4-5, max_tokens 2048 (markdown).</w:t>
             </w:r>
           </w:p>
         </w:tc>
@@ -1572,7 +1572,7 @@
                 <w:sz w:val="18"/>
                 <w:szCs w:val="18"/>
               </w:rPr>
-              <w:t xml:space="preserve">Pro plan</w:t>
+              <w:t xml:space="preserve">Hobby (free) plan</w:t>
             </w:r>
           </w:p>
         </w:tc>
@@ -1600,7 +1600,7 @@
                 <w:sz w:val="18"/>
                 <w:szCs w:val="18"/>
               </w:rPr>
-              <w:t xml:space="preserve">Cron routes protected by CRON_SECRET. Deploy on push to main.</w:t>
+              <w:t xml:space="preserve">Cron routes protected by CRON_SECRET. Deploy on push to main. Hobby: max 2 cron jobs; cron-run history retained ~12h in Observability (30-day needs paid Observability Plus).</w:t>
             </w:r>
           </w:p>
         </w:tc>
@@ -1844,7 +1844,7 @@
                 <w:sz w:val="18"/>
                 <w:szCs w:val="18"/>
               </w:rPr>
-              <w:t xml:space="preserve">Server-side only. Used in /api/screener/detail.</w:t>
+              <w:t xml:space="preserve">Server-side only. Used in /api/screener/detail, /api/brief, /api/cron/thesis-alerts.</w:t>
             </w:r>
           </w:p>
         </w:tc>
@@ -2952,7 +2952,7 @@
                 <w:sz w:val="18"/>
                 <w:szCs w:val="18"/>
               </w:rPr>
-              <w:t xml:space="preserve">user_id, tickers (text[]), updated_at</w:t>
+              <w:t xml:space="preserve">user_id, tickers (text[]), alert_tickers (text[]), is_pro, alerts_enabled, email_frequency (daily|weekly), user_email, lemon_subscription_id, updated_at</w:t>
             </w:r>
           </w:p>
         </w:tc>
@@ -2980,7 +2980,7 @@
                 <w:sz w:val="18"/>
                 <w:szCs w:val="18"/>
               </w:rPr>
-              <w:t xml:space="preserve">Saved watchlist tickers per user.</w:t>
+              <w:t xml:space="preserve">Central per-user state: watchlist + Pro alert config + subscription status.</w:t>
             </w:r>
           </w:p>
         </w:tc>
@@ -3008,7 +3008,7 @@
                 <w:sz w:val="18"/>
                 <w:szCs w:val="18"/>
               </w:rPr>
-              <w:t xml:space="preserve">Updated on every watchlist save.</w:t>
+              <w:t xml:space="preserve">Written on watchlist save, alert-ticker save, and Lemon Squeezy webhook.</w:t>
             </w:r>
           </w:p>
         </w:tc>
@@ -3152,7 +3152,7 @@
                 <w:sz w:val="18"/>
                 <w:szCs w:val="18"/>
               </w:rPr>
-              <w:t xml:space="preserve">profiles</w:t>
+              <w:t xml:space="preserve">briefs</w:t>
             </w:r>
           </w:p>
         </w:tc>
@@ -3180,7 +3180,7 @@
                 <w:sz w:val="18"/>
                 <w:szCs w:val="18"/>
               </w:rPr>
-              <w:t xml:space="preserve">id, is_pro, email_enabled, email_frequency, ls_customer_id, ls_subscription_id</w:t>
+              <w:t xml:space="preserve">id, tickers (text[]), content, created_at</w:t>
             </w:r>
           </w:p>
         </w:tc>
@@ -3208,7 +3208,7 @@
                 <w:sz w:val="18"/>
                 <w:szCs w:val="18"/>
               </w:rPr>
-              <w:t xml:space="preserve">User profile and subscription status.</w:t>
+              <w:t xml:space="preserve">Saved portfolio briefs, rendered publicly at /brief/[id].</w:t>
             </w:r>
           </w:p>
         </w:tc>
@@ -3236,7 +3236,7 @@
                 <w:sz w:val="18"/>
                 <w:szCs w:val="18"/>
               </w:rPr>
-              <w:t xml:space="preserve">Populated by Lemon Squeezy webhook. is_pro gates Pro features. ls_* fields store LS IDs.</w:t>
+              <w:t xml:space="preserve">Read by the shared-brief page.</w:t>
             </w:r>
           </w:p>
         </w:tc>
@@ -3266,7 +3266,7 @@
                 <w:sz w:val="18"/>
                 <w:szCs w:val="18"/>
               </w:rPr>
-              <w:t xml:space="preserve">alert_tickers</w:t>
+              <w:t xml:space="preserve">thesis_snapshots</w:t>
             </w:r>
           </w:p>
         </w:tc>
@@ -3294,7 +3294,7 @@
                 <w:sz w:val="18"/>
                 <w:szCs w:val="18"/>
               </w:rPr>
-              <w:t xml:space="preserve">user_id, tickers (text[])</w:t>
+              <w:t xml:space="preserve">user_id, symbol, sentiment, thesis, analyst_rating, last_news_headlines, checked_at</w:t>
             </w:r>
           </w:p>
         </w:tc>
@@ -3322,7 +3322,7 @@
                 <w:sz w:val="18"/>
                 <w:szCs w:val="18"/>
               </w:rPr>
-              <w:t xml:space="preserve">Tickers for Pro thesis-change email alerts.</w:t>
+              <w:t xml:space="preserve">Last thesis snapshot per user per ticker for change detection.</w:t>
             </w:r>
           </w:p>
         </w:tc>
@@ -3350,7 +3350,7 @@
                 <w:sz w:val="18"/>
                 <w:szCs w:val="18"/>
               </w:rPr>
-              <w:t xml:space="preserve">Read by /api/cron/thesis-alerts daily.</w:t>
+              <w:t xml:space="preserve">thesis-alerts cron compares fresh thesis to stored; polarity flip triggers email.</w:t>
             </w:r>
           </w:p>
         </w:tc>
@@ -3380,7 +3380,7 @@
                 <w:sz w:val="18"/>
                 <w:szCs w:val="18"/>
               </w:rPr>
-              <w:t xml:space="preserve">thesis_history</w:t>
+              <w:t xml:space="preserve">cache</w:t>
             </w:r>
           </w:p>
         </w:tc>
@@ -3408,7 +3408,7 @@
                 <w:sz w:val="18"/>
                 <w:szCs w:val="18"/>
               </w:rPr>
-              <w:t xml:space="preserve">user_id, symbol, thesis, checked_at</w:t>
+              <w:t xml:space="preserve">service-role only</w:t>
             </w:r>
           </w:p>
         </w:tc>
@@ -3436,7 +3436,7 @@
                 <w:sz w:val="18"/>
                 <w:szCs w:val="18"/>
               </w:rPr>
-              <w:t xml:space="preserve">Last thesis per user per ticker for change detection.</w:t>
+              <w:t xml:space="preserve">Server-side cache table.</w:t>
             </w:r>
           </w:p>
         </w:tc>
@@ -3464,7 +3464,121 @@
                 <w:sz w:val="18"/>
                 <w:szCs w:val="18"/>
               </w:rPr>
-              <w:t xml:space="preserve">Cron compares new thesis to stored. Polarity flip triggers email alert.</w:t>
+              <w:t xml:space="preserve">RLS enabled, no client policies.</w:t>
+            </w:r>
+          </w:p>
+        </w:tc>
+      </w:tr>
+      <w:tr>
+        <w:tc>
+          <w:tcPr>
+            <w:tcW w:type="dxa" w:w="1800"/>
+            <w:tcBorders>
+              <w:top w:val="single" w:color="CCCCCC" w:sz="1"/>
+              <w:left w:val="single" w:color="CCCCCC" w:sz="1"/>
+              <w:bottom w:val="single" w:color="CCCCCC" w:sz="1"/>
+              <w:right w:val="single" w:color="CCCCCC" w:sz="1"/>
+            </w:tcBorders>
+            <w:shd w:fill="FFFFFF" w:val="clear"/>
+            <w:tcMar>
+              <w:top w:type="dxa" w:w="80"/>
+              <w:left w:type="dxa" w:w="120"/>
+              <w:bottom w:type="dxa" w:w="80"/>
+              <w:right w:type="dxa" w:w="120"/>
+            </w:tcMar>
+          </w:tcPr>
+          <w:p>
+            <w:r>
+              <w:rPr>
+                <w:rFonts w:ascii="Courier New" w:cs="Courier New" w:eastAsia="Courier New" w:hAnsi="Courier New"/>
+                <w:sz w:val="18"/>
+                <w:szCs w:val="18"/>
+              </w:rPr>
+              <w:t xml:space="preserve">promo_codes</w:t>
+            </w:r>
+          </w:p>
+        </w:tc>
+        <w:tc>
+          <w:tcPr>
+            <w:tcW w:type="dxa" w:w="2800"/>
+            <w:tcBorders>
+              <w:top w:val="single" w:color="CCCCCC" w:sz="1"/>
+              <w:left w:val="single" w:color="CCCCCC" w:sz="1"/>
+              <w:bottom w:val="single" w:color="CCCCCC" w:sz="1"/>
+              <w:right w:val="single" w:color="CCCCCC" w:sz="1"/>
+            </w:tcBorders>
+            <w:shd w:fill="FFFFFF" w:val="clear"/>
+            <w:tcMar>
+              <w:top w:type="dxa" w:w="80"/>
+              <w:left w:type="dxa" w:w="120"/>
+              <w:bottom w:type="dxa" w:w="80"/>
+              <w:right w:type="dxa" w:w="120"/>
+            </w:tcMar>
+          </w:tcPr>
+          <w:p>
+            <w:r>
+              <w:rPr>
+                <w:rFonts w:ascii="Courier New" w:cs="Courier New" w:eastAsia="Courier New" w:hAnsi="Courier New"/>
+                <w:sz w:val="18"/>
+                <w:szCs w:val="18"/>
+              </w:rPr>
+              <w:t xml:space="preserve">service-role only</w:t>
+            </w:r>
+          </w:p>
+        </w:tc>
+        <w:tc>
+          <w:tcPr>
+            <w:tcW w:type="dxa" w:w="2400"/>
+            <w:tcBorders>
+              <w:top w:val="single" w:color="CCCCCC" w:sz="1"/>
+              <w:left w:val="single" w:color="CCCCCC" w:sz="1"/>
+              <w:bottom w:val="single" w:color="CCCCCC" w:sz="1"/>
+              <w:right w:val="single" w:color="CCCCCC" w:sz="1"/>
+            </w:tcBorders>
+            <w:shd w:fill="FFFFFF" w:val="clear"/>
+            <w:tcMar>
+              <w:top w:type="dxa" w:w="80"/>
+              <w:left w:type="dxa" w:w="120"/>
+              <w:bottom w:type="dxa" w:w="80"/>
+              <w:right w:type="dxa" w:w="120"/>
+            </w:tcMar>
+          </w:tcPr>
+          <w:p>
+            <w:r>
+              <w:rPr>
+                <w:rFonts w:ascii="Arial" w:cs="Arial" w:eastAsia="Arial" w:hAnsi="Arial"/>
+                <w:sz w:val="18"/>
+                <w:szCs w:val="18"/>
+              </w:rPr>
+              <w:t xml:space="preserve">Promo code redemption.</w:t>
+            </w:r>
+          </w:p>
+        </w:tc>
+        <w:tc>
+          <w:tcPr>
+            <w:tcW w:type="dxa" w:w="2360"/>
+            <w:tcBorders>
+              <w:top w:val="single" w:color="CCCCCC" w:sz="1"/>
+              <w:left w:val="single" w:color="CCCCCC" w:sz="1"/>
+              <w:bottom w:val="single" w:color="CCCCCC" w:sz="1"/>
+              <w:right w:val="single" w:color="CCCCCC" w:sz="1"/>
+            </w:tcBorders>
+            <w:shd w:fill="FFFFFF" w:val="clear"/>
+            <w:tcMar>
+              <w:top w:type="dxa" w:w="80"/>
+              <w:left w:type="dxa" w:w="120"/>
+              <w:bottom w:type="dxa" w:w="80"/>
+              <w:right w:type="dxa" w:w="120"/>
+            </w:tcMar>
+          </w:tcPr>
+          <w:p>
+            <w:r>
+              <w:rPr>
+                <w:rFonts w:ascii="Arial" w:cs="Arial" w:eastAsia="Arial" w:hAnsi="Arial"/>
+                <w:sz w:val="18"/>
+                <w:szCs w:val="18"/>
+              </w:rPr>
+              <w:t xml:space="preserve">RLS enabled, no client policies.</w:t>
             </w:r>
           </w:p>
         </w:tc>
@@ -3768,7 +3882,7 @@
                 <w:sz w:val="18"/>
                 <w:szCs w:val="18"/>
               </w:rPr>
-              <w:t xml:space="preserve">Main stock card. 7 Finnhub reqs parallel + Claude Haiku. 20-min server cache.</w:t>
+              <w:t xml:space="preserve">Main stock card. 7 Finnhub reqs parallel + Claude Haiku (max_tokens 650). 20-min in-process Map cache (not the Supabase cache table).</w:t>
             </w:r>
           </w:p>
         </w:tc>
@@ -3912,7 +4026,7 @@
                 <w:sz w:val="18"/>
                 <w:szCs w:val="18"/>
               </w:rPr>
-              <w:t xml:space="preserve">/api/chart</w:t>
+              <w:t xml:space="preserve">/api/screener/search</w:t>
             </w:r>
           </w:p>
         </w:tc>
@@ -3996,7 +4110,7 @@
                 <w:sz w:val="18"/>
                 <w:szCs w:val="18"/>
               </w:rPr>
-              <w:t xml:space="preserve">3M candles + EMA 200 from Massive. Fetches 2Y, trims to last 63 days. 1hr cache.</w:t>
+              <w:t xml:space="preserve">Ticker search via Finnhub — Common Stock only, no dotted symbols. Coexists with /api/search.</w:t>
             </w:r>
           </w:p>
         </w:tc>
@@ -4026,7 +4140,7 @@
                 <w:sz w:val="18"/>
                 <w:szCs w:val="18"/>
               </w:rPr>
-              <w:t xml:space="preserve">/api/prices</w:t>
+              <w:t xml:space="preserve">/api/chart</w:t>
             </w:r>
           </w:p>
         </w:tc>
@@ -4110,7 +4224,7 @@
                 <w:sz w:val="18"/>
                 <w:szCs w:val="18"/>
               </w:rPr>
-              <w:t xml:space="preserve">Live price snapshot from Massive. Market hours only (Mon-Fri 13:30-21:00 UTC). no-store.</w:t>
+              <w:t xml:space="preserve">3M candles + EMA 200 from Massive. Fetches 2Y, trims to last 63 days. 1hr cache.</w:t>
             </w:r>
           </w:p>
         </w:tc>
@@ -4140,7 +4254,7 @@
                 <w:sz w:val="18"/>
                 <w:szCs w:val="18"/>
               </w:rPr>
-              <w:t xml:space="preserve">/api/feedback</w:t>
+              <w:t xml:space="preserve">/api/prices</w:t>
             </w:r>
           </w:p>
         </w:tc>
@@ -4168,7 +4282,7 @@
                 <w:sz w:val="18"/>
                 <w:szCs w:val="18"/>
               </w:rPr>
-              <w:t xml:space="preserve">POST</w:t>
+              <w:t xml:space="preserve">GET</w:t>
             </w:r>
           </w:p>
         </w:tc>
@@ -4196,7 +4310,7 @@
                 <w:sz w:val="18"/>
                 <w:szCs w:val="18"/>
               </w:rPr>
-              <w:t xml:space="preserve">Optional</w:t>
+              <w:t xml:space="preserve">None</w:t>
             </w:r>
           </w:p>
         </w:tc>
@@ -4224,7 +4338,7 @@
                 <w:sz w:val="18"/>
                 <w:szCs w:val="18"/>
               </w:rPr>
-              <w:t xml:space="preserve">Inserts into brief_feedback. Works for unauthenticated guests.</w:t>
+              <w:t xml:space="preserve">Live price snapshot from Massive. Market hours only (Mon-Fri 13:30-21:00 UTC). no-store.</w:t>
             </w:r>
           </w:p>
         </w:tc>
@@ -4254,7 +4368,7 @@
                 <w:sz w:val="18"/>
                 <w:szCs w:val="18"/>
               </w:rPr>
-              <w:t xml:space="preserve">/api/brief</w:t>
+              <w:t xml:space="preserve">/api/feedback</w:t>
             </w:r>
           </w:p>
         </w:tc>
@@ -4310,7 +4424,7 @@
                 <w:sz w:val="18"/>
                 <w:szCs w:val="18"/>
               </w:rPr>
-              <w:t xml:space="preserve">Required</w:t>
+              <w:t xml:space="preserve">Optional</w:t>
             </w:r>
           </w:p>
         </w:tc>
@@ -4338,7 +4452,7 @@
                 <w:sz w:val="18"/>
                 <w:szCs w:val="18"/>
               </w:rPr>
-              <w:t xml:space="preserve">Batch brief generation. Requires Supabase session.</w:t>
+              <w:t xml:space="preserve">Inserts into brief_feedback. Works for unauthenticated guests.</w:t>
             </w:r>
           </w:p>
         </w:tc>
@@ -4368,7 +4482,7 @@
                 <w:sz w:val="18"/>
                 <w:szCs w:val="18"/>
               </w:rPr>
-              <w:t xml:space="preserve">/api/email-prefs</w:t>
+              <w:t xml:space="preserve">/api/brief</w:t>
             </w:r>
           </w:p>
         </w:tc>
@@ -4396,7 +4510,7 @@
                 <w:sz w:val="18"/>
                 <w:szCs w:val="18"/>
               </w:rPr>
-              <w:t xml:space="preserve">GET/POST</w:t>
+              <w:t xml:space="preserve">POST</w:t>
             </w:r>
           </w:p>
         </w:tc>
@@ -4452,7 +4566,7 @@
                 <w:sz w:val="18"/>
                 <w:szCs w:val="18"/>
               </w:rPr>
-              <w:t xml:space="preserve">Read/write user email preferences (enabled, frequency).</w:t>
+              <w:t xml:space="preserve">Batch portfolio brief (claude-sonnet-4-5, markdown). Requires Supabase session.</w:t>
             </w:r>
           </w:p>
         </w:tc>
@@ -4482,7 +4596,7 @@
                 <w:sz w:val="18"/>
                 <w:szCs w:val="18"/>
               </w:rPr>
-              <w:t xml:space="preserve">/api/alert-tickers</w:t>
+              <w:t xml:space="preserve">/api/email-prefs</w:t>
             </w:r>
           </w:p>
         </w:tc>
@@ -4566,7 +4680,7 @@
                 <w:sz w:val="18"/>
                 <w:szCs w:val="18"/>
               </w:rPr>
-              <w:t xml:space="preserve">Read/write Pro user thesis alert watchlist.</w:t>
+              <w:t xml:space="preserve">Read/write user email preferences (enabled, frequency).</w:t>
             </w:r>
           </w:p>
         </w:tc>
@@ -4596,7 +4710,7 @@
                 <w:sz w:val="18"/>
                 <w:szCs w:val="18"/>
               </w:rPr>
-              <w:t xml:space="preserve">/api/earnings</w:t>
+              <w:t xml:space="preserve">/api/alert-tickers</w:t>
             </w:r>
           </w:p>
         </w:tc>
@@ -4624,7 +4738,7 @@
                 <w:sz w:val="18"/>
                 <w:szCs w:val="18"/>
               </w:rPr>
-              <w:t xml:space="preserve">GET</w:t>
+              <w:t xml:space="preserve">GET/POST</w:t>
             </w:r>
           </w:p>
         </w:tc>
@@ -4652,7 +4766,7 @@
                 <w:sz w:val="18"/>
                 <w:szCs w:val="18"/>
               </w:rPr>
-              <w:t xml:space="preserve">None</w:t>
+              <w:t xml:space="preserve">Required</w:t>
             </w:r>
           </w:p>
         </w:tc>
@@ -4680,7 +4794,7 @@
                 <w:sz w:val="18"/>
                 <w:szCs w:val="18"/>
               </w:rPr>
-              <w:t xml:space="preserve">Earnings calendar data from Finnhub.</w:t>
+              <w:t xml:space="preserve">Read/write Pro thesis-alert watchlist — portfolios.alert_tickers (capped at 10).</w:t>
             </w:r>
           </w:p>
         </w:tc>
@@ -4710,7 +4824,7 @@
                 <w:sz w:val="18"/>
                 <w:szCs w:val="18"/>
               </w:rPr>
-              <w:t xml:space="preserve">/api/macro</w:t>
+              <w:t xml:space="preserve">/api/earnings</w:t>
             </w:r>
           </w:p>
         </w:tc>
@@ -4794,7 +4908,7 @@
                 <w:sz w:val="18"/>
                 <w:szCs w:val="18"/>
               </w:rPr>
-              <w:t xml:space="preserve">Macro economic indicators.</w:t>
+              <w:t xml:space="preserve">Earnings calendar data from Finnhub.</w:t>
             </w:r>
           </w:p>
         </w:tc>
@@ -4824,7 +4938,7 @@
                 <w:sz w:val="18"/>
                 <w:szCs w:val="18"/>
               </w:rPr>
-              <w:t xml:space="preserve">/api/sectors/detail</w:t>
+              <w:t xml:space="preserve">/api/macro</w:t>
             </w:r>
           </w:p>
         </w:tc>
@@ -4908,7 +5022,7 @@
                 <w:sz w:val="18"/>
                 <w:szCs w:val="18"/>
               </w:rPr>
-              <w:t xml:space="preserve">Sector-level data and performance.</w:t>
+              <w:t xml:space="preserve">Macro economic indicators.</w:t>
             </w:r>
           </w:p>
         </w:tc>
@@ -4938,7 +5052,7 @@
                 <w:sz w:val="18"/>
                 <w:szCs w:val="18"/>
               </w:rPr>
-              <w:t xml:space="preserve">/api/ipos</w:t>
+              <w:t xml:space="preserve">/api/sectors/detail</w:t>
             </w:r>
           </w:p>
         </w:tc>
@@ -5022,7 +5136,7 @@
                 <w:sz w:val="18"/>
                 <w:szCs w:val="18"/>
               </w:rPr>
-              <w:t xml:space="preserve">IPO pipeline from Finnhub.</w:t>
+              <w:t xml:space="preserve">Sector-level data and performance.</w:t>
             </w:r>
           </w:p>
         </w:tc>
@@ -5052,7 +5166,7 @@
                 <w:sz w:val="18"/>
                 <w:szCs w:val="18"/>
               </w:rPr>
-              <w:t xml:space="preserve">/api/lemon/checkout</w:t>
+              <w:t xml:space="preserve">/api/ipos</w:t>
             </w:r>
           </w:p>
         </w:tc>
@@ -5080,7 +5194,7 @@
                 <w:sz w:val="18"/>
                 <w:szCs w:val="18"/>
               </w:rPr>
-              <w:t xml:space="preserve">POST</w:t>
+              <w:t xml:space="preserve">GET</w:t>
             </w:r>
           </w:p>
         </w:tc>
@@ -5108,7 +5222,7 @@
                 <w:sz w:val="18"/>
                 <w:szCs w:val="18"/>
               </w:rPr>
-              <w:t xml:space="preserve">Required</w:t>
+              <w:t xml:space="preserve">None</w:t>
             </w:r>
           </w:p>
         </w:tc>
@@ -5136,7 +5250,7 @@
                 <w:sz w:val="18"/>
                 <w:szCs w:val="18"/>
               </w:rPr>
-              <w:t xml:space="preserve">Creates Lemon Squeezy checkout session for Pro upgrade.</w:t>
+              <w:t xml:space="preserve">IPO pipeline from Finnhub.</w:t>
             </w:r>
           </w:p>
         </w:tc>
@@ -5166,7 +5280,7 @@
                 <w:sz w:val="18"/>
                 <w:szCs w:val="18"/>
               </w:rPr>
-              <w:t xml:space="preserve">/api/lemon/cancel</w:t>
+              <w:t xml:space="preserve">/api/lemon/checkout</w:t>
             </w:r>
           </w:p>
         </w:tc>
@@ -5250,7 +5364,7 @@
                 <w:sz w:val="18"/>
                 <w:szCs w:val="18"/>
               </w:rPr>
-              <w:t xml:space="preserve">Cancels active Lemon Squeezy subscription.</w:t>
+              <w:t xml:space="preserve">Creates Lemon Squeezy checkout session for Pro upgrade.</w:t>
             </w:r>
           </w:p>
         </w:tc>
@@ -5280,7 +5394,7 @@
                 <w:sz w:val="18"/>
                 <w:szCs w:val="18"/>
               </w:rPr>
-              <w:t xml:space="preserve">/api/lemon/webhook</w:t>
+              <w:t xml:space="preserve">/api/lemon/cancel</w:t>
             </w:r>
           </w:p>
         </w:tc>
@@ -5336,7 +5450,7 @@
                 <w:sz w:val="18"/>
                 <w:szCs w:val="18"/>
               </w:rPr>
-              <w:t xml:space="preserve">HMAC-SHA256</w:t>
+              <w:t xml:space="preserve">Required</w:t>
             </w:r>
           </w:p>
         </w:tc>
@@ -5364,7 +5478,7 @@
                 <w:sz w:val="18"/>
                 <w:szCs w:val="18"/>
               </w:rPr>
-              <w:t xml:space="preserve">Lemon Squeezy lifecycle events. Updates profiles table. Timing-safe compare.</w:t>
+              <w:t xml:space="preserve">Cancels active Lemon Squeezy subscription.</w:t>
             </w:r>
           </w:p>
         </w:tc>
@@ -5394,7 +5508,7 @@
                 <w:sz w:val="18"/>
                 <w:szCs w:val="18"/>
               </w:rPr>
-              <w:t xml:space="preserve">/api/promo/redeem</w:t>
+              <w:t xml:space="preserve">/api/lemon/webhook</w:t>
             </w:r>
           </w:p>
         </w:tc>
@@ -5450,7 +5564,7 @@
                 <w:sz w:val="18"/>
                 <w:szCs w:val="18"/>
               </w:rPr>
-              <w:t xml:space="preserve">Required</w:t>
+              <w:t xml:space="preserve">HMAC-SHA256</w:t>
             </w:r>
           </w:p>
         </w:tc>
@@ -5478,7 +5592,7 @@
                 <w:sz w:val="18"/>
                 <w:szCs w:val="18"/>
               </w:rPr>
-              <w:t xml:space="preserve">Redeems promo code. Input max 50 chars.</w:t>
+              <w:t xml:space="preserve">Lemon Squeezy lifecycle events. Updates portfolios (is_pro, lemon_subscription_id). Timing-safe compare.</w:t>
             </w:r>
           </w:p>
         </w:tc>
@@ -5508,7 +5622,7 @@
                 <w:sz w:val="18"/>
                 <w:szCs w:val="18"/>
               </w:rPr>
-              <w:t xml:space="preserve">/api/cron/thesis-alerts</w:t>
+              <w:t xml:space="preserve">/api/promo/redeem</w:t>
             </w:r>
           </w:p>
         </w:tc>
@@ -5536,7 +5650,7 @@
                 <w:sz w:val="18"/>
                 <w:szCs w:val="18"/>
               </w:rPr>
-              <w:t xml:space="preserve">GET</w:t>
+              <w:t xml:space="preserve">POST</w:t>
             </w:r>
           </w:p>
         </w:tc>
@@ -5564,7 +5678,7 @@
                 <w:sz w:val="18"/>
                 <w:szCs w:val="18"/>
               </w:rPr>
-              <w:t xml:space="preserve">CRON_SECRET</w:t>
+              <w:t xml:space="preserve">Required</w:t>
             </w:r>
           </w:p>
         </w:tc>
@@ -5592,7 +5706,7 @@
                 <w:sz w:val="18"/>
                 <w:szCs w:val="18"/>
               </w:rPr>
-              <w:t xml:space="preserve">Daily: checks thesis for each alert ticker, emails user if polarity flipped.</w:t>
+              <w:t xml:space="preserve">Redeems promo code. Input max 50 chars.</w:t>
             </w:r>
           </w:p>
         </w:tc>
@@ -5622,7 +5736,7 @@
                 <w:sz w:val="18"/>
                 <w:szCs w:val="18"/>
               </w:rPr>
-              <w:t xml:space="preserve">/api/cron/email-report</w:t>
+              <w:t xml:space="preserve">/api/cron/thesis-alerts</w:t>
             </w:r>
           </w:p>
         </w:tc>
@@ -5706,7 +5820,7 @@
                 <w:sz w:val="18"/>
                 <w:szCs w:val="18"/>
               </w:rPr>
-              <w:t xml:space="preserve">Daily/weekly: sends personalized portfolio email brief via Resend.</w:t>
+              <w:t xml:space="preserve">Weekday sweep: checks thesis per alert ticker, emails user if polarity flipped. Invocation runs every scheduled time regardless of whether any email sends.</w:t>
             </w:r>
           </w:p>
         </w:tc>
@@ -5736,6 +5850,120 @@
                 <w:sz w:val="18"/>
                 <w:szCs w:val="18"/>
               </w:rPr>
+              <w:t xml:space="preserve">/api/cron/email-report</w:t>
+            </w:r>
+          </w:p>
+        </w:tc>
+        <w:tc>
+          <w:tcPr>
+            <w:tcW w:type="dxa" w:w="900"/>
+            <w:tcBorders>
+              <w:top w:val="single" w:color="CCCCCC" w:sz="1"/>
+              <w:left w:val="single" w:color="CCCCCC" w:sz="1"/>
+              <w:bottom w:val="single" w:color="CCCCCC" w:sz="1"/>
+              <w:right w:val="single" w:color="CCCCCC" w:sz="1"/>
+            </w:tcBorders>
+            <w:shd w:fill="F5F5F5" w:val="clear"/>
+            <w:tcMar>
+              <w:top w:type="dxa" w:w="80"/>
+              <w:left w:type="dxa" w:w="120"/>
+              <w:bottom w:type="dxa" w:w="80"/>
+              <w:right w:type="dxa" w:w="120"/>
+            </w:tcMar>
+          </w:tcPr>
+          <w:p>
+            <w:r>
+              <w:rPr>
+                <w:rFonts w:ascii="Arial" w:cs="Arial" w:eastAsia="Arial" w:hAnsi="Arial"/>
+                <w:sz w:val="18"/>
+                <w:szCs w:val="18"/>
+              </w:rPr>
+              <w:t xml:space="preserve">GET</w:t>
+            </w:r>
+          </w:p>
+        </w:tc>
+        <w:tc>
+          <w:tcPr>
+            <w:tcW w:type="dxa" w:w="1000"/>
+            <w:tcBorders>
+              <w:top w:val="single" w:color="CCCCCC" w:sz="1"/>
+              <w:left w:val="single" w:color="CCCCCC" w:sz="1"/>
+              <w:bottom w:val="single" w:color="CCCCCC" w:sz="1"/>
+              <w:right w:val="single" w:color="CCCCCC" w:sz="1"/>
+            </w:tcBorders>
+            <w:shd w:fill="F5F5F5" w:val="clear"/>
+            <w:tcMar>
+              <w:top w:type="dxa" w:w="80"/>
+              <w:left w:type="dxa" w:w="120"/>
+              <w:bottom w:type="dxa" w:w="80"/>
+              <w:right w:type="dxa" w:w="120"/>
+            </w:tcMar>
+          </w:tcPr>
+          <w:p>
+            <w:r>
+              <w:rPr>
+                <w:rFonts w:ascii="Arial" w:cs="Arial" w:eastAsia="Arial" w:hAnsi="Arial"/>
+                <w:sz w:val="18"/>
+                <w:szCs w:val="18"/>
+              </w:rPr>
+              <w:t xml:space="preserve">CRON_SECRET</w:t>
+            </w:r>
+          </w:p>
+        </w:tc>
+        <w:tc>
+          <w:tcPr>
+            <w:tcW w:type="dxa" w:w="4660"/>
+            <w:tcBorders>
+              <w:top w:val="single" w:color="CCCCCC" w:sz="1"/>
+              <w:left w:val="single" w:color="CCCCCC" w:sz="1"/>
+              <w:bottom w:val="single" w:color="CCCCCC" w:sz="1"/>
+              <w:right w:val="single" w:color="CCCCCC" w:sz="1"/>
+            </w:tcBorders>
+            <w:shd w:fill="F5F5F5" w:val="clear"/>
+            <w:tcMar>
+              <w:top w:type="dxa" w:w="80"/>
+              <w:left w:type="dxa" w:w="120"/>
+              <w:bottom w:type="dxa" w:w="80"/>
+              <w:right w:type="dxa" w:w="120"/>
+            </w:tcMar>
+          </w:tcPr>
+          <w:p>
+            <w:r>
+              <w:rPr>
+                <w:rFonts w:ascii="Arial" w:cs="Arial" w:eastAsia="Arial" w:hAnsi="Arial"/>
+                <w:sz w:val="18"/>
+                <w:szCs w:val="18"/>
+              </w:rPr>
+              <w:t xml:space="preserve">Daily/weekly: sends personalized portfolio email brief via Resend. Weekly variant sends on Mondays only.</w:t>
+            </w:r>
+          </w:p>
+        </w:tc>
+      </w:tr>
+      <w:tr>
+        <w:tc>
+          <w:tcPr>
+            <w:tcW w:type="dxa" w:w="2800"/>
+            <w:tcBorders>
+              <w:top w:val="single" w:color="CCCCCC" w:sz="1"/>
+              <w:left w:val="single" w:color="CCCCCC" w:sz="1"/>
+              <w:bottom w:val="single" w:color="CCCCCC" w:sz="1"/>
+              <w:right w:val="single" w:color="CCCCCC" w:sz="1"/>
+            </w:tcBorders>
+            <w:shd w:fill="FFFFFF" w:val="clear"/>
+            <w:tcMar>
+              <w:top w:type="dxa" w:w="80"/>
+              <w:left w:type="dxa" w:w="120"/>
+              <w:bottom w:type="dxa" w:w="80"/>
+              <w:right w:type="dxa" w:w="120"/>
+            </w:tcMar>
+          </w:tcPr>
+          <w:p>
+            <w:r>
+              <w:rPr>
+                <w:rFonts w:ascii="Courier New" w:cs="Courier New" w:eastAsia="Courier New" w:hAnsi="Courier New"/>
+                <w:sz w:val="18"/>
+                <w:szCs w:val="18"/>
+              </w:rPr>
               <w:t xml:space="preserve">/api/waitlist</w:t>
             </w:r>
           </w:p>
@@ -5749,7 +5977,7 @@
               <w:bottom w:val="single" w:color="CCCCCC" w:sz="1"/>
               <w:right w:val="single" w:color="CCCCCC" w:sz="1"/>
             </w:tcBorders>
-            <w:shd w:fill="F5F5F5" w:val="clear"/>
+            <w:shd w:fill="FFFFFF" w:val="clear"/>
             <w:tcMar>
               <w:top w:type="dxa" w:w="80"/>
               <w:left w:type="dxa" w:w="120"/>
@@ -5777,7 +6005,7 @@
               <w:bottom w:val="single" w:color="CCCCCC" w:sz="1"/>
               <w:right w:val="single" w:color="CCCCCC" w:sz="1"/>
             </w:tcBorders>
-            <w:shd w:fill="F5F5F5" w:val="clear"/>
+            <w:shd w:fill="FFFFFF" w:val="clear"/>
             <w:tcMar>
               <w:top w:type="dxa" w:w="80"/>
               <w:left w:type="dxa" w:w="120"/>
@@ -5805,7 +6033,7 @@
               <w:bottom w:val="single" w:color="CCCCCC" w:sz="1"/>
               <w:right w:val="single" w:color="CCCCCC" w:sz="1"/>
             </w:tcBorders>
-            <w:shd w:fill="F5F5F5" w:val="clear"/>
+            <w:shd w:fill="FFFFFF" w:val="clear"/>
             <w:tcMar>
               <w:top w:type="dxa" w:w="80"/>
               <w:left w:type="dxa" w:w="120"/>
@@ -6004,7 +6232,7 @@
                 <w:sz w:val="18"/>
                 <w:szCs w:val="18"/>
               </w:rPr>
-              <w:t xml:space="preserve">7 Finnhub endpoints fetched in parallel per card: profile2, quote, metrics, recommendations, news, earnings, peers. Claude Haiku generates 5 AI fields. 20-min in-memory server cache.</w:t>
+              <w:t xml:space="preserve">7 Finnhub endpoints fetched in parallel per card: profile2, quote, metrics, recommendations, news, earnings, peers. Claude Haiku generates 5 AI fields (max_tokens 650). 20-min in-process Map cache — per serverless instance, wiped on cold start (NOT the Supabase cache table).</w:t>
             </w:r>
           </w:p>
         </w:tc>
@@ -6034,7 +6262,7 @@
                 <w:sz w:val="18"/>
                 <w:szCs w:val="18"/>
               </w:rPr>
-              <w:t xml:space="preserve">isProfitable logic</w:t>
+              <w:t xml:space="preserve">Model usage</w:t>
             </w:r>
           </w:p>
         </w:tc>
@@ -6062,7 +6290,7 @@
                 <w:sz w:val="18"/>
                 <w:szCs w:val="18"/>
               </w:rPr>
-              <w:t xml:space="preserve">(eps &gt; 0) || (peValue &gt; 0). P/E is more reliable than EPS for large caps like Amazon.</w:t>
+              <w:t xml:space="preserve">Per-card detail + thesis-alerts news classification: Haiku (claude-haiku-4-5-20251001). Portfolio brief /api/brief: claude-sonnet-4-5 (max_tokens 2048). Pre-profit companies get a venture-frame prompt; stale analyst consensus (&gt;90d) and recent listings (&lt;18mo) flagged; dataQuality strong/moderate/thin returned.</w:t>
             </w:r>
           </w:p>
         </w:tc>
@@ -6092,7 +6320,7 @@
                 <w:sz w:val="18"/>
                 <w:szCs w:val="18"/>
               </w:rPr>
-              <w:t xml:space="preserve">Peers filter</w:t>
+              <w:t xml:space="preserve">isProfitable logic</w:t>
             </w:r>
           </w:p>
         </w:tc>
@@ -6120,7 +6348,7 @@
                 <w:sz w:val="18"/>
                 <w:szCs w:val="18"/>
               </w:rPr>
-              <w:t xml:space="preserve">US-listed only: /^[A-Z]{1,5}$/ or /^[A-Z]{1,4}\.[A-Z]$/. Blocks .TO, .AX, .L etc.</w:t>
+              <w:t xml:space="preserve">(eps &gt; 0) || (peValue &gt; 0). P/E is more reliable than EPS for large caps like Amazon.</w:t>
             </w:r>
           </w:p>
         </w:tc>
@@ -6150,7 +6378,7 @@
                 <w:sz w:val="18"/>
                 <w:szCs w:val="18"/>
               </w:rPr>
-              <w:t xml:space="preserve">Symbol sanitization</w:t>
+              <w:t xml:space="preserve">Peers filter</w:t>
             </w:r>
           </w:p>
         </w:tc>
@@ -6178,7 +6406,7 @@
                 <w:sz w:val="18"/>
                 <w:szCs w:val="18"/>
               </w:rPr>
-              <w:t xml:space="preserve">Applied before every API call: /^[A-Z0-9.\-]{1,10}$/. Rejects anything outside this pattern.</w:t>
+              <w:t xml:space="preserve">US-listed only: /^[A-Z]{1,5}$/ or /^[A-Z]{1,4}\.[A-Z]$/. Blocks .TO, .AX, .L etc.</w:t>
             </w:r>
           </w:p>
         </w:tc>
@@ -6208,7 +6436,7 @@
                 <w:sz w:val="18"/>
                 <w:szCs w:val="18"/>
               </w:rPr>
-              <w:t xml:space="preserve">Chart / EMA 200</w:t>
+              <w:t xml:space="preserve">Symbol sanitization</w:t>
             </w:r>
           </w:p>
         </w:tc>
@@ -6236,7 +6464,7 @@
                 <w:sz w:val="18"/>
                 <w:szCs w:val="18"/>
               </w:rPr>
-              <w:t xml:space="preserve">Fetches 2Y candles (limit=750) for EMA warm-up. k = 2/(N+1). Seeds with SMA of first 200. Displays last 63 days (3M).</w:t>
+              <w:t xml:space="preserve">Applied before every API call: /^[A-Z0-9.\-]{1,10}$/. Rejects anything outside this pattern.</w:t>
             </w:r>
           </w:p>
         </w:tc>
@@ -6266,7 +6494,7 @@
                 <w:sz w:val="18"/>
                 <w:szCs w:val="18"/>
               </w:rPr>
-              <w:t xml:space="preserve">Live prices</w:t>
+              <w:t xml:space="preserve">Chart / EMA 200</w:t>
             </w:r>
           </w:p>
         </w:tc>
@@ -6294,7 +6522,7 @@
                 <w:sz w:val="18"/>
                 <w:szCs w:val="18"/>
               </w:rPr>
-              <w:t xml:space="preserve">Massive snapshot polled every 10s during market hours. Check: Mon-Fri 13:30-21:00 UTC. Green pulsing dot + "Live" nav indicator.</w:t>
+              <w:t xml:space="preserve">Fetches 2Y candles (limit=750) for EMA warm-up. k = 2/(N+1). Seeds with SMA of first 200. Displays last 63 days (3M).</w:t>
             </w:r>
           </w:p>
         </w:tc>
@@ -6324,7 +6552,7 @@
                 <w:sz w:val="18"/>
                 <w:szCs w:val="18"/>
               </w:rPr>
-              <w:t xml:space="preserve">Client cache</w:t>
+              <w:t xml:space="preserve">Live prices</w:t>
             </w:r>
           </w:p>
         </w:tc>
@@ -6352,7 +6580,7 @@
                 <w:sz w:val="18"/>
                 <w:szCs w:val="18"/>
               </w:rPr>
-              <w:t xml:space="preserve">localStorage key ab_stock_{SYMBOL} with 20-min TTL. Email prefs: ab_email_prefs. Clear manually to test fresh data.</w:t>
+              <w:t xml:space="preserve">Massive snapshot polled every 10s during market hours. Check: Mon-Fri 13:30-21:00 UTC. Green pulsing dot + "Live" nav indicator.</w:t>
             </w:r>
           </w:p>
         </w:tc>
@@ -6382,7 +6610,7 @@
                 <w:sz w:val="18"/>
                 <w:szCs w:val="18"/>
               </w:rPr>
-              <w:t xml:space="preserve">Auth pattern</w:t>
+              <w:t xml:space="preserve">Client cache</w:t>
             </w:r>
           </w:p>
         </w:tc>
@@ -6410,7 +6638,7 @@
                 <w:sz w:val="18"/>
                 <w:szCs w:val="18"/>
               </w:rPr>
-              <w:t xml:space="preserve">SSR auth via @supabase/ssr. Server: createServerClient + cookies(). Admin: createClient with service role key. Never expose service role key client-side.</w:t>
+              <w:t xml:space="preserve">localStorage key ab_stock_{SYMBOL} with 20-min TTL. Email prefs: ab_email_prefs. Clear manually to test fresh data.</w:t>
             </w:r>
           </w:p>
         </w:tc>
@@ -6440,7 +6668,7 @@
                 <w:sz w:val="18"/>
                 <w:szCs w:val="18"/>
               </w:rPr>
-              <w:t xml:space="preserve">Lemon Squeezy webhook</w:t>
+              <w:t xml:space="preserve">Auth pattern</w:t>
             </w:r>
           </w:p>
         </w:tc>
@@ -6468,7 +6696,7 @@
                 <w:sz w:val="18"/>
                 <w:szCs w:val="18"/>
               </w:rPr>
-              <w:t xml:space="preserve">crypto.timingSafeEqual for HMAC-SHA256 (NOT ===). Hex comparison. Updates profiles on subscription events.</w:t>
+              <w:t xml:space="preserve">SSR auth via @supabase/ssr. Server: createServerClient + cookies(). Admin: createClient with service role key. Never expose service role key client-side.</w:t>
             </w:r>
           </w:p>
         </w:tc>
@@ -6498,7 +6726,7 @@
                 <w:sz w:val="18"/>
                 <w:szCs w:val="18"/>
               </w:rPr>
-              <w:t xml:space="preserve">Thesis alert cron</w:t>
+              <w:t xml:space="preserve">Lemon Squeezy webhook</w:t>
             </w:r>
           </w:p>
         </w:tc>
@@ -6526,7 +6754,7 @@
                 <w:sz w:val="18"/>
                 <w:szCs w:val="18"/>
               </w:rPr>
-              <w:t xml:space="preserve">Daily: reads alert_tickers, generates fresh thesis, compares to thesis_history. Polarity flip (positive&lt;&gt;negative) triggers Resend email.</w:t>
+              <w:t xml:space="preserve">crypto.timingSafeEqual for HMAC-SHA256 (NOT ===). Hex comparison. Updates portfolios on subscription events.</w:t>
             </w:r>
           </w:p>
         </w:tc>
@@ -6556,7 +6784,7 @@
                 <w:sz w:val="18"/>
                 <w:szCs w:val="18"/>
               </w:rPr>
-              <w:t xml:space="preserve">Massive.com notes</w:t>
+              <w:t xml:space="preserve">Thesis alert cron</w:t>
             </w:r>
           </w:p>
         </w:tc>
@@ -6584,7 +6812,7 @@
                 <w:sz w:val="18"/>
                 <w:szCs w:val="18"/>
               </w:rPr>
-              <w:t xml:space="preserve">Rebranded from Polygon.io Oct 2025. api.polygon.io still resolves. Free plan: candles + snapshots. Fundamentals need paid add-on.</w:t>
+              <w:t xml:space="preserve">Weekday sweep: reads portfolios (alert_tickers), generates fresh thesis, compares to thesis_snapshots. Polarity flip (positive&lt;&gt;negative) triggers Resend email. Snapshot updated each run.</w:t>
             </w:r>
           </w:p>
         </w:tc>
@@ -6614,6 +6842,64 @@
                 <w:sz w:val="18"/>
                 <w:szCs w:val="18"/>
               </w:rPr>
+              <w:t xml:space="preserve">Massive.com notes</w:t>
+            </w:r>
+          </w:p>
+        </w:tc>
+        <w:tc>
+          <w:tcPr>
+            <w:tcW w:type="dxa" w:w="7160"/>
+            <w:tcBorders>
+              <w:top w:val="single" w:color="CCCCCC" w:sz="1"/>
+              <w:left w:val="single" w:color="CCCCCC" w:sz="1"/>
+              <w:bottom w:val="single" w:color="CCCCCC" w:sz="1"/>
+              <w:right w:val="single" w:color="CCCCCC" w:sz="1"/>
+            </w:tcBorders>
+            <w:shd w:fill="FFFFFF" w:val="clear"/>
+            <w:tcMar>
+              <w:top w:type="dxa" w:w="80"/>
+              <w:left w:type="dxa" w:w="120"/>
+              <w:bottom w:type="dxa" w:w="80"/>
+              <w:right w:type="dxa" w:w="120"/>
+            </w:tcMar>
+          </w:tcPr>
+          <w:p>
+            <w:r>
+              <w:rPr>
+                <w:rFonts w:ascii="Arial" w:cs="Arial" w:eastAsia="Arial" w:hAnsi="Arial"/>
+                <w:sz w:val="18"/>
+                <w:szCs w:val="18"/>
+              </w:rPr>
+              <w:t xml:space="preserve">Rebranded from Polygon.io Oct 2025. api.polygon.io still resolves. Free plan: candles + snapshots. Fundamentals need paid add-on.</w:t>
+            </w:r>
+          </w:p>
+        </w:tc>
+      </w:tr>
+      <w:tr>
+        <w:tc>
+          <w:tcPr>
+            <w:tcW w:type="dxa" w:w="2200"/>
+            <w:tcBorders>
+              <w:top w:val="single" w:color="CCCCCC" w:sz="1"/>
+              <w:left w:val="single" w:color="CCCCCC" w:sz="1"/>
+              <w:bottom w:val="single" w:color="CCCCCC" w:sz="1"/>
+              <w:right w:val="single" w:color="CCCCCC" w:sz="1"/>
+            </w:tcBorders>
+            <w:shd w:fill="F5F5F5" w:val="clear"/>
+            <w:tcMar>
+              <w:top w:type="dxa" w:w="80"/>
+              <w:left w:type="dxa" w:w="120"/>
+              <w:bottom w:type="dxa" w:w="80"/>
+              <w:right w:type="dxa" w:w="120"/>
+            </w:tcMar>
+          </w:tcPr>
+          <w:p>
+            <w:r>
+              <w:rPr>
+                <w:rFonts w:ascii="Arial" w:cs="Arial" w:eastAsia="Arial" w:hAnsi="Arial"/>
+                <w:sz w:val="18"/>
+                <w:szCs w:val="18"/>
+              </w:rPr>
               <w:t xml:space="preserve">Git workflow</w:t>
             </w:r>
           </w:p>
@@ -6627,22 +6913,22 @@
               <w:bottom w:val="single" w:color="CCCCCC" w:sz="1"/>
               <w:right w:val="single" w:color="CCCCCC" w:sz="1"/>
             </w:tcBorders>
-            <w:shd w:fill="FFFFFF" w:val="clear"/>
-            <w:tcMar>
-              <w:top w:type="dxa" w:w="80"/>
-              <w:left w:type="dxa" w:w="120"/>
-              <w:bottom w:type="dxa" w:w="80"/>
-              <w:right w:type="dxa" w:w="120"/>
-            </w:tcMar>
-          </w:tcPr>
-          <w:p>
-            <w:r>
-              <w:rPr>
-                <w:rFonts w:ascii="Arial" w:cs="Arial" w:eastAsia="Arial" w:hAnsi="Arial"/>
-                <w:sz w:val="18"/>
-                <w:szCs w:val="18"/>
-              </w:rPr>
-              <w:t xml:space="preserve">Sandbox cannot push to GitHub. Always tell Eyal: cd ~/Desktop/alphabrief &amp;&amp; git push. Lock fix: rm -f .git/HEAD.lock .git/index.lock.</w:t>
+            <w:shd w:fill="F5F5F5" w:val="clear"/>
+            <w:tcMar>
+              <w:top w:type="dxa" w:w="80"/>
+              <w:left w:type="dxa" w:w="120"/>
+              <w:bottom w:type="dxa" w:w="80"/>
+              <w:right w:type="dxa" w:w="120"/>
+            </w:tcMar>
+          </w:tcPr>
+          <w:p>
+            <w:r>
+              <w:rPr>
+                <w:rFonts w:ascii="Arial" w:cs="Arial" w:eastAsia="Arial" w:hAnsi="Arial"/>
+                <w:sz w:val="18"/>
+                <w:szCs w:val="18"/>
+              </w:rPr>
+              <w:t xml:space="preserve">Sandbox cannot push to GitHub. Always tell Eyal: cd "$HOME/Desktop/TEAMs/Team Business/alphabrief" &amp;&amp; git push. Lock fix: rm -f .git/HEAD.lock .git/index.lock.</w:t>
             </w:r>
           </w:p>
         </w:tc>
@@ -7296,6 +7582,178 @@
                 <w:szCs w:val="18"/>
               </w:rPr>
               <w:t xml:space="preserve">Sector view.</w:t>
+            </w:r>
+          </w:p>
+        </w:tc>
+      </w:tr>
+      <w:tr>
+        <w:tc>
+          <w:tcPr>
+            <w:tcW w:type="dxa" w:w="1800"/>
+            <w:tcBorders>
+              <w:top w:val="single" w:color="CCCCCC" w:sz="1"/>
+              <w:left w:val="single" w:color="CCCCCC" w:sz="1"/>
+              <w:bottom w:val="single" w:color="CCCCCC" w:sz="1"/>
+              <w:right w:val="single" w:color="CCCCCC" w:sz="1"/>
+            </w:tcBorders>
+            <w:shd w:fill="F5F5F5" w:val="clear"/>
+            <w:tcMar>
+              <w:top w:type="dxa" w:w="80"/>
+              <w:left w:type="dxa" w:w="120"/>
+              <w:bottom w:type="dxa" w:w="80"/>
+              <w:right w:type="dxa" w:w="120"/>
+            </w:tcMar>
+          </w:tcPr>
+          <w:p>
+            <w:r>
+              <w:rPr>
+                <w:rFonts w:ascii="Courier New" w:cs="Courier New" w:eastAsia="Courier New" w:hAnsi="Courier New"/>
+                <w:sz w:val="18"/>
+                <w:szCs w:val="18"/>
+              </w:rPr>
+              <w:t xml:space="preserve">/app/screener</w:t>
+            </w:r>
+          </w:p>
+        </w:tc>
+        <w:tc>
+          <w:tcPr>
+            <w:tcW w:type="dxa" w:w="3600"/>
+            <w:tcBorders>
+              <w:top w:val="single" w:color="CCCCCC" w:sz="1"/>
+              <w:left w:val="single" w:color="CCCCCC" w:sz="1"/>
+              <w:bottom w:val="single" w:color="CCCCCC" w:sz="1"/>
+              <w:right w:val="single" w:color="CCCCCC" w:sz="1"/>
+            </w:tcBorders>
+            <w:shd w:fill="F5F5F5" w:val="clear"/>
+            <w:tcMar>
+              <w:top w:type="dxa" w:w="80"/>
+              <w:left w:type="dxa" w:w="120"/>
+              <w:bottom w:type="dxa" w:w="80"/>
+              <w:right w:type="dxa" w:w="120"/>
+            </w:tcMar>
+          </w:tcPr>
+          <w:p>
+            <w:r>
+              <w:rPr>
+                <w:rFonts w:ascii="Courier New" w:cs="Courier New" w:eastAsia="Courier New" w:hAnsi="Courier New"/>
+                <w:sz w:val="18"/>
+                <w:szCs w:val="18"/>
+              </w:rPr>
+              <w:t xml:space="preserve">src/app/app/screener/page.tsx</w:t>
+            </w:r>
+          </w:p>
+        </w:tc>
+        <w:tc>
+          <w:tcPr>
+            <w:tcW w:type="dxa" w:w="3960"/>
+            <w:tcBorders>
+              <w:top w:val="single" w:color="CCCCCC" w:sz="1"/>
+              <w:left w:val="single" w:color="CCCCCC" w:sz="1"/>
+              <w:bottom w:val="single" w:color="CCCCCC" w:sz="1"/>
+              <w:right w:val="single" w:color="CCCCCC" w:sz="1"/>
+            </w:tcBorders>
+            <w:shd w:fill="F5F5F5" w:val="clear"/>
+            <w:tcMar>
+              <w:top w:type="dxa" w:w="80"/>
+              <w:left w:type="dxa" w:w="120"/>
+              <w:bottom w:type="dxa" w:w="80"/>
+              <w:right w:type="dxa" w:w="120"/>
+            </w:tcMar>
+          </w:tcPr>
+          <w:p>
+            <w:r>
+              <w:rPr>
+                <w:rFonts w:ascii="Arial" w:cs="Arial" w:eastAsia="Arial" w:hAnsi="Arial"/>
+                <w:sz w:val="18"/>
+                <w:szCs w:val="18"/>
+              </w:rPr>
+              <w:t xml:space="preserve">Legacy redirect → /app.</w:t>
+            </w:r>
+          </w:p>
+        </w:tc>
+      </w:tr>
+      <w:tr>
+        <w:tc>
+          <w:tcPr>
+            <w:tcW w:type="dxa" w:w="1800"/>
+            <w:tcBorders>
+              <w:top w:val="single" w:color="CCCCCC" w:sz="1"/>
+              <w:left w:val="single" w:color="CCCCCC" w:sz="1"/>
+              <w:bottom w:val="single" w:color="CCCCCC" w:sz="1"/>
+              <w:right w:val="single" w:color="CCCCCC" w:sz="1"/>
+            </w:tcBorders>
+            <w:shd w:fill="FFFFFF" w:val="clear"/>
+            <w:tcMar>
+              <w:top w:type="dxa" w:w="80"/>
+              <w:left w:type="dxa" w:w="120"/>
+              <w:bottom w:type="dxa" w:w="80"/>
+              <w:right w:type="dxa" w:w="120"/>
+            </w:tcMar>
+          </w:tcPr>
+          <w:p>
+            <w:r>
+              <w:rPr>
+                <w:rFonts w:ascii="Courier New" w:cs="Courier New" w:eastAsia="Courier New" w:hAnsi="Courier New"/>
+                <w:sz w:val="18"/>
+                <w:szCs w:val="18"/>
+              </w:rPr>
+              <w:t xml:space="preserve">/brief/[id]</w:t>
+            </w:r>
+          </w:p>
+        </w:tc>
+        <w:tc>
+          <w:tcPr>
+            <w:tcW w:type="dxa" w:w="3600"/>
+            <w:tcBorders>
+              <w:top w:val="single" w:color="CCCCCC" w:sz="1"/>
+              <w:left w:val="single" w:color="CCCCCC" w:sz="1"/>
+              <w:bottom w:val="single" w:color="CCCCCC" w:sz="1"/>
+              <w:right w:val="single" w:color="CCCCCC" w:sz="1"/>
+            </w:tcBorders>
+            <w:shd w:fill="FFFFFF" w:val="clear"/>
+            <w:tcMar>
+              <w:top w:type="dxa" w:w="80"/>
+              <w:left w:type="dxa" w:w="120"/>
+              <w:bottom w:type="dxa" w:w="80"/>
+              <w:right w:type="dxa" w:w="120"/>
+            </w:tcMar>
+          </w:tcPr>
+          <w:p>
+            <w:r>
+              <w:rPr>
+                <w:rFonts w:ascii="Courier New" w:cs="Courier New" w:eastAsia="Courier New" w:hAnsi="Courier New"/>
+                <w:sz w:val="18"/>
+                <w:szCs w:val="18"/>
+              </w:rPr>
+              <w:t xml:space="preserve">src/app/brief/[id]/page.tsx</w:t>
+            </w:r>
+          </w:p>
+        </w:tc>
+        <w:tc>
+          <w:tcPr>
+            <w:tcW w:type="dxa" w:w="3960"/>
+            <w:tcBorders>
+              <w:top w:val="single" w:color="CCCCCC" w:sz="1"/>
+              <w:left w:val="single" w:color="CCCCCC" w:sz="1"/>
+              <w:bottom w:val="single" w:color="CCCCCC" w:sz="1"/>
+              <w:right w:val="single" w:color="CCCCCC" w:sz="1"/>
+            </w:tcBorders>
+            <w:shd w:fill="FFFFFF" w:val="clear"/>
+            <w:tcMar>
+              <w:top w:type="dxa" w:w="80"/>
+              <w:left w:type="dxa" w:w="120"/>
+              <w:bottom w:type="dxa" w:w="80"/>
+              <w:right w:type="dxa" w:w="120"/>
+            </w:tcMar>
+          </w:tcPr>
+          <w:p>
+            <w:r>
+              <w:rPr>
+                <w:rFonts w:ascii="Arial" w:cs="Arial" w:eastAsia="Arial" w:hAnsi="Arial"/>
+                <w:sz w:val="18"/>
+                <w:szCs w:val="18"/>
+              </w:rPr>
+              <w:t xml:space="preserve">Public shared-brief reader — reads briefs table, renders markdown.</w:t>
             </w:r>
           </w:p>
         </w:tc>
@@ -8095,7 +8553,7 @@
         <w:sz w:val="16"/>
         <w:szCs w:val="16"/>
       </w:rPr>
-      <w:t xml:space="preserve">Updated June 21, 2026  |  Page </w:t>
+      <w:t xml:space="preserve">Updated July 24, 2026  |  Page </w:t>
     </w:r>
     <w:r>
       <w:rPr>

</xml_diff>

<commit_message>
test: add /api/cron/ping to settle Vercel Hobby cron limits
Our services doc claimed "Hobby: max 2 cron jobs", which is stale and
caused a planning error in the thesis-alerting rebuild. Vercel's cron
usage docs (updated 2026-06-16) say Hobby allows 100 cron jobs per
project, with the restriction being frequency (once per day) and
precision (+/-59 min), not quantity.

This adds a third cron pointing at a trivial heartbeat route so the
deploy answers the count question, and the next day's run answers the
firing question. No production side effects: the route is CRON_SECRET
protected and returns {ok, firedAt} without touching data or email.

Services doc corrected and regenerated in the same commit per the
repo's mandatory-maintenance rule.

Remove the route and the cron entry once the answer is recorded.

Co-Authored-By: Claude Opus 5 <noreply@anthropic.com>
</commit_message>
<xml_diff>
--- a/AlphaBrief-Services-Reference.docx
+++ b/AlphaBrief-Services-Reference.docx
@@ -1600,7 +1600,7 @@
                 <w:sz w:val="18"/>
                 <w:szCs w:val="18"/>
               </w:rPr>
-              <w:t xml:space="preserve">Cron routes protected by CRON_SECRET. Deploy on push to main. Hobby: max 2 cron jobs; cron-run history retained ~12h in Observability (30-day needs paid Observability Plus).</w:t>
+              <w:t xml:space="preserve">Cron routes protected by CRON_SECRET. Deploy on push to main. Hobby limits per Vercel docs (updated 2026-06-16): 100 cron jobs per project, minimum interval ONCE PER DAY, scheduling precision per-hour (+/-59 min) — a job set for 12:00 fires anywhere in the 12:00-12:59 hour. The previous "max 2 cron jobs" note here was stale and caused a planning error; being confirmed empirically via /api/cron/ping. Cron-run history retained ~12h in Observability (30-day needs paid Observability Plus).</w:t>
             </w:r>
           </w:p>
         </w:tc>
@@ -5964,6 +5964,120 @@
                 <w:sz w:val="18"/>
                 <w:szCs w:val="18"/>
               </w:rPr>
+              <w:t xml:space="preserve">/api/cron/ping</w:t>
+            </w:r>
+          </w:p>
+        </w:tc>
+        <w:tc>
+          <w:tcPr>
+            <w:tcW w:type="dxa" w:w="900"/>
+            <w:tcBorders>
+              <w:top w:val="single" w:color="CCCCCC" w:sz="1"/>
+              <w:left w:val="single" w:color="CCCCCC" w:sz="1"/>
+              <w:bottom w:val="single" w:color="CCCCCC" w:sz="1"/>
+              <w:right w:val="single" w:color="CCCCCC" w:sz="1"/>
+            </w:tcBorders>
+            <w:shd w:fill="FFFFFF" w:val="clear"/>
+            <w:tcMar>
+              <w:top w:type="dxa" w:w="80"/>
+              <w:left w:type="dxa" w:w="120"/>
+              <w:bottom w:type="dxa" w:w="80"/>
+              <w:right w:type="dxa" w:w="120"/>
+            </w:tcMar>
+          </w:tcPr>
+          <w:p>
+            <w:r>
+              <w:rPr>
+                <w:rFonts w:ascii="Arial" w:cs="Arial" w:eastAsia="Arial" w:hAnsi="Arial"/>
+                <w:sz w:val="18"/>
+                <w:szCs w:val="18"/>
+              </w:rPr>
+              <w:t xml:space="preserve">GET</w:t>
+            </w:r>
+          </w:p>
+        </w:tc>
+        <w:tc>
+          <w:tcPr>
+            <w:tcW w:type="dxa" w:w="1000"/>
+            <w:tcBorders>
+              <w:top w:val="single" w:color="CCCCCC" w:sz="1"/>
+              <w:left w:val="single" w:color="CCCCCC" w:sz="1"/>
+              <w:bottom w:val="single" w:color="CCCCCC" w:sz="1"/>
+              <w:right w:val="single" w:color="CCCCCC" w:sz="1"/>
+            </w:tcBorders>
+            <w:shd w:fill="FFFFFF" w:val="clear"/>
+            <w:tcMar>
+              <w:top w:type="dxa" w:w="80"/>
+              <w:left w:type="dxa" w:w="120"/>
+              <w:bottom w:type="dxa" w:w="80"/>
+              <w:right w:type="dxa" w:w="120"/>
+            </w:tcMar>
+          </w:tcPr>
+          <w:p>
+            <w:r>
+              <w:rPr>
+                <w:rFonts w:ascii="Arial" w:cs="Arial" w:eastAsia="Arial" w:hAnsi="Arial"/>
+                <w:sz w:val="18"/>
+                <w:szCs w:val="18"/>
+              </w:rPr>
+              <w:t xml:space="preserve">CRON_SECRET</w:t>
+            </w:r>
+          </w:p>
+        </w:tc>
+        <w:tc>
+          <w:tcPr>
+            <w:tcW w:type="dxa" w:w="4660"/>
+            <w:tcBorders>
+              <w:top w:val="single" w:color="CCCCCC" w:sz="1"/>
+              <w:left w:val="single" w:color="CCCCCC" w:sz="1"/>
+              <w:bottom w:val="single" w:color="CCCCCC" w:sz="1"/>
+              <w:right w:val="single" w:color="CCCCCC" w:sz="1"/>
+            </w:tcBorders>
+            <w:shd w:fill="FFFFFF" w:val="clear"/>
+            <w:tcMar>
+              <w:top w:type="dxa" w:w="80"/>
+              <w:left w:type="dxa" w:w="120"/>
+              <w:bottom w:type="dxa" w:w="80"/>
+              <w:right w:type="dxa" w:w="120"/>
+            </w:tcMar>
+          </w:tcPr>
+          <w:p>
+            <w:r>
+              <w:rPr>
+                <w:rFonts w:ascii="Arial" w:cs="Arial" w:eastAsia="Arial" w:hAnsi="Arial"/>
+                <w:sz w:val="18"/>
+                <w:szCs w:val="18"/>
+              </w:rPr>
+              <w:t xml:space="preserve">Heartbeat. Returns {ok, firedAt} and nothing else. Exists to confirm Hobby cron count/frequency limits empirically. Remove once the answer is recorded above.</w:t>
+            </w:r>
+          </w:p>
+        </w:tc>
+      </w:tr>
+      <w:tr>
+        <w:tc>
+          <w:tcPr>
+            <w:tcW w:type="dxa" w:w="2800"/>
+            <w:tcBorders>
+              <w:top w:val="single" w:color="CCCCCC" w:sz="1"/>
+              <w:left w:val="single" w:color="CCCCCC" w:sz="1"/>
+              <w:bottom w:val="single" w:color="CCCCCC" w:sz="1"/>
+              <w:right w:val="single" w:color="CCCCCC" w:sz="1"/>
+            </w:tcBorders>
+            <w:shd w:fill="F5F5F5" w:val="clear"/>
+            <w:tcMar>
+              <w:top w:type="dxa" w:w="80"/>
+              <w:left w:type="dxa" w:w="120"/>
+              <w:bottom w:type="dxa" w:w="80"/>
+              <w:right w:type="dxa" w:w="120"/>
+            </w:tcMar>
+          </w:tcPr>
+          <w:p>
+            <w:r>
+              <w:rPr>
+                <w:rFonts w:ascii="Courier New" w:cs="Courier New" w:eastAsia="Courier New" w:hAnsi="Courier New"/>
+                <w:sz w:val="18"/>
+                <w:szCs w:val="18"/>
+              </w:rPr>
               <w:t xml:space="preserve">/api/waitlist</w:t>
             </w:r>
           </w:p>
@@ -5977,7 +6091,7 @@
               <w:bottom w:val="single" w:color="CCCCCC" w:sz="1"/>
               <w:right w:val="single" w:color="CCCCCC" w:sz="1"/>
             </w:tcBorders>
-            <w:shd w:fill="FFFFFF" w:val="clear"/>
+            <w:shd w:fill="F5F5F5" w:val="clear"/>
             <w:tcMar>
               <w:top w:type="dxa" w:w="80"/>
               <w:left w:type="dxa" w:w="120"/>
@@ -6005,7 +6119,7 @@
               <w:bottom w:val="single" w:color="CCCCCC" w:sz="1"/>
               <w:right w:val="single" w:color="CCCCCC" w:sz="1"/>
             </w:tcBorders>
-            <w:shd w:fill="FFFFFF" w:val="clear"/>
+            <w:shd w:fill="F5F5F5" w:val="clear"/>
             <w:tcMar>
               <w:top w:type="dxa" w:w="80"/>
               <w:left w:type="dxa" w:w="120"/>
@@ -6033,7 +6147,7 @@
               <w:bottom w:val="single" w:color="CCCCCC" w:sz="1"/>
               <w:right w:val="single" w:color="CCCCCC" w:sz="1"/>
             </w:tcBorders>
-            <w:shd w:fill="FFFFFF" w:val="clear"/>
+            <w:shd w:fill="F5F5F5" w:val="clear"/>
             <w:tcMar>
               <w:top w:type="dxa" w:w="80"/>
               <w:left w:type="dxa" w:w="120"/>

</xml_diff>